<commit_message>
Add official patent technical drawings (Figs 1-9), embed image in Word document, and synchronize reference numerals
</commit_message>
<xml_diff>
--- a/Patent_Draft_Predictive_Worker_Safety_Helmet.docx
+++ b/Patent_Draft_Predictive_Worker_Safety_Helmet.docx
@@ -806,7 +806,7 @@
         <w:ind w:left="360"/>
       </w:pPr>
       <w:r>
-        <w:t>The present invention relates generally to industrial occupational safety systems, wearable embedded electronic devices, and edge computing. More specifically, the present invention relates to an Internet of Things (IoT) and Machine Learning (ML) enabled smart helmet system designed for continuous multi-modal environmental hazard detection, worker physiological biometric monitoring, 6-axis kinematic fall and impact detection, on-device predictive risk scoring, and dual-mode resilient wireless telemetry dispatch for construction, mining, and hazardous industrial sites.</w:t>
+        <w:t>The present invention relates generally to industrial occupational safety systems, wearable embedded electronic devices, and edge computing. More specifically, the present invention relates to an Internet of Things (IoT) and Machine Learning (ML) enabled predictive smart helmet capable of multi-modal environmental hazard detection, worker physiological biometric monitoring, 6-axis kinematic fall and impact detection, on-device predictive risk scoring, and dual-mode resilient wireless telemetry dispatch for construction, mining, and hazardous industrial sites.</w:t>
       </w:r>
     </w:p>
     <w:p>
@@ -833,12 +833,12 @@
         <w:ind w:left="360"/>
       </w:pPr>
       <w:r>
-        <w:t>Conventional safety helmets used in construction and industrial sectors are passive structural headgear engineered solely for mechanical shock absorption. They are incapable of detecting invisible environmental hazards (toxic gases, elevated thermal exposure) or physiological collapse in workers.</w:t>
+        <w:t>Conventional safety headgear used in industrial, construction, and mining facilities consists predominantly of passive thermoplastic or fiberglass shells engineered solely to cushion mechanical impact from falling debris. However, these traditional helmets cannot sense invisible hazards such as dangerous ambient toxic gases, prolonged extreme thermal exposure, or acute physiological distress in workers.</w:t>
         <w:br/>
         <w:br/>
-        <w:t>Recent electronic helmet systems incorporate individual sensors but suffer from critical shortcomings:</w:t>
+        <w:t>Recent electronic safety helmets integrate single-variable sensors but suffer from critical drawbacks:</w:t>
         <w:br/>
-        <w:t>1. Static Thresholding &amp; High False Alarms: Existing devices trigger alarms based on instantaneous threshold breaches, failing to detect gradual pre-incident hazard accumulation or generating nuisance alarms.</w:t>
+        <w:t>1. Static Thresholding &amp; High False Alarms: Existing devices trigger alarms based on rigid, point-in-time threshold breaches, failing to detect gradual pre-incident hazard buildup or generating nuisance alarms.</w:t>
         <w:br/>
         <w:t>2. Lack of Predictive Multi-Sensor Fusion: Conventional systems do not correlate physiological metrics (heart rate) with ambient parameters (temperature, toxic gases) and kinematic vectors (acceleration magnitude, jerk).</w:t>
         <w:br/>
@@ -947,10 +947,10 @@
         <w:ind w:left="360"/>
       </w:pPr>
       <w:r>
-        <w:t>The present invention is an IoT and Machine Learning-enabled Predictive Worker Safety Helmet. The device comprises an industrial protective helmet shell (100) embedding a 32-bit dual-core microcontroller (101, ESP32 SoC), a temperature sensor (102), a toxic gas sensor (103), an optical photoplethysmography (PPG) heart rate sensor (104), a 6-axis Inertial Measurement Unit (105, MPU6050 accelerometer and gyroscope), a GPS receiver (106), an audiovisual alert module (107, piezoelectric buzzer and high-luminescence LED), and a hybrid wireless transceiver (108, Wi-Fi and sub-GHz LoRa), powered by a rechargeable power management circuit (109).</w:t>
+        <w:t>The present invention is an IoT and Machine Learning-enabled Predictive Worker Safety Helmet. The device comprises an industrial protective helmet shell (100) embedding a Global Positioning System (GPS) module (101) mounted at the top crown, a dual temperature and hazardous gas sensor unit (102) positioned on the forward lateral housing, an audiovisual warning unit (103, piezoelectric buzzer and high-intensity LED) positioned on the front visor brim, an ergonomic chin strap (104) with an embedded photoplethysmography (PPG) pulse sensor for continuous pulse rate acquisition, a 6-axis Inertial Measurement Unit (105, IMU containing 3-axis accelerometer and 3-axis gyroscope) mounted on the lateral shell, and a central microcontroller and edge processing unit (106, ESP32 SoC with Wi-Fi/LoRa transceiver and power management circuitry) housed in a protected rear/lateral enclosure.</w:t>
         <w:br/>
         <w:br/>
-        <w:t>The microcontroller samples multi-sensor feeds, applies edge noise filtering, and extracts dynamic statistical features (acceleration magnitude, jerk derivative, rate of temperature change, and gas concentration). A trained machine learning model running on the edge processor computes a real-time Risk Score (0–100). When the score exceeds predefined safety bounds or a critical fall/impact signature is recognized, the helmet immediately actuates local audiovisual warnings and dispatches an emergency telemetry packet containing worker ID, physiological vitals, and GPS coordinates to a central supervisory dashboard (111).</w:t>
+        <w:t>The microcontroller samples multi-sensor feeds, applies edge noise filtering, and extracts dynamic statistical features (acceleration magnitude, jerk derivative, rate of temperature change, and gas concentration). A trained machine learning model running on the edge processor computes a real-time Risk Score (0–100). When the score exceeds predefined safety bounds or a critical fall/impact signature is recognized, the helmet immediately actuates local audiovisual warnings (103) and dispatches an emergency telemetry packet containing worker ID, physiological vitals, and GPS coordinates (101) to a central supervisory dashboard.</w:t>
       </w:r>
     </w:p>
     <w:p>
@@ -977,46 +977,43 @@
         <w:ind w:left="360"/>
       </w:pPr>
       <w:r>
-        <w:t>Figure 1 illustrates the architectural block diagram and electrical hardware configuration of the predictive worker safety helmet system according to the present invention. Whereas:</w:t>
-        <w:br/>
-        <w:t>100 denotes smart helmet protective shell,</w:t>
-        <w:br/>
-        <w:t>101 denotes microcontroller and edge processing unit (ESP32 SoC),</w:t>
-        <w:br/>
-        <w:t>102 denotes temperature sensor module,</w:t>
-        <w:br/>
-        <w:t>103 denotes hazardous/toxic gas sensor module,</w:t>
-        <w:br/>
-        <w:t>104 denotes biometric PPG heart rate sensor,</w:t>
-        <w:br/>
-        <w:t>105 denotes 6-axis inertial measurement unit (IMU - MPU6050),</w:t>
-        <w:br/>
-        <w:t>106 denotes global positioning system (GPS) module,</w:t>
-        <w:br/>
-        <w:t>107 denotes audiovisual warning unit (piezoelectric buzzer and alert LED),</w:t>
-        <w:br/>
-        <w:t>108 denotes hybrid wireless telemetry interface (Wi-Fi / LoRa),</w:t>
-        <w:br/>
-        <w:t>109 denotes rechargeable power management and battery unit,</w:t>
-        <w:br/>
-        <w:t>110 denotes cloud server and central database repository,</w:t>
-        <w:br/>
-        <w:t>111 denotes supervisory IoT monitoring dashboard and safety terminal.</w:t>
+        <w:t>The invention is illustrated in the accompanying technical drawings (Figs. 1 to 9), wherein single common numerals are used to designate specific structural and electronic components across all views:</w:t>
         <w:br/>
         <w:br/>
-        <w:t>Figure 2 illustrates the machine learning predictive risk assessment and emergency alert execution pipeline. Whereas:</w:t>
+        <w:t>• Figure 1 illustrates a Perspective View of the assembled predictive worker safety helmet.</w:t>
         <w:br/>
-        <w:t>200 denotes multi-sensor real-time data acquisition stage,</w:t>
+        <w:t>• Figure 2 illustrates a Front View of the predictive worker safety helmet.</w:t>
         <w:br/>
-        <w:t>201 denotes edge data cleaning and noise filtering stage,</w:t>
+        <w:t>• Figure 3 illustrates a Side View of the predictive worker safety helmet.</w:t>
         <w:br/>
-        <w:t>202 denotes dynamic feature extraction engine,</w:t>
+        <w:t>• Figure 4 illustrates a Top View showing crown component placement.</w:t>
         <w:br/>
-        <w:t>203 denotes machine learning predictive risk assessment engine (trained model),</w:t>
+        <w:t>• Figure 5 illustrates a Rear View showing the main controller enclosure.</w:t>
         <w:br/>
-        <w:t>204 denotes risk scoring (0–100) and tri-level classification logic,</w:t>
+        <w:t>• Figure 6 illustrates a Bottom View (Inside) displaying internal harness and strap arrangement.</w:t>
         <w:br/>
-        <w:t>205 denotes dual-action local warning and cloud telemetry dispatch module.</w:t>
+        <w:t>• Figure 7 illustrates a Sectional View (taken along section line A–A).</w:t>
+        <w:br/>
+        <w:t>• Figure 8 illustrates an Exploded View depicting the mechanical and electronic modular assembly.</w:t>
+        <w:br/>
+        <w:t>• Figure 9 illustrates Individual Component Views of constituent sub-assemblies.</w:t>
+        <w:br/>
+        <w:br/>
+        <w:t>Reference Numerals Denoting Components in Drawings:</w:t>
+        <w:br/>
+        <w:t>100 denotes Helmet Shell (Protective outer casing)</w:t>
+        <w:br/>
+        <w:t>101 denotes GPS Module (Geospatial positioning unit)</w:t>
+        <w:br/>
+        <w:t>102 denotes Temperature &amp; Gas Sensor (Multi-modal environmental sensing module)</w:t>
+        <w:br/>
+        <w:t>103 denotes Buzzer &amp; LED (Audiovisual alarm &amp; optical warning unit)</w:t>
+        <w:br/>
+        <w:t>104 denotes Chin Strap (Ergonomic harness with integrated biometric pulse sensor)</w:t>
+        <w:br/>
+        <w:t>105 denotes IMU (6-axis Accelerometer &amp; Gyroscope kinematic sensor)</w:t>
+        <w:br/>
+        <w:t>106 denotes ESP32 Controller (Main edge processing &amp; wireless telemetry unit)</w:t>
       </w:r>
     </w:p>
     <w:p>
@@ -1043,24 +1040,33 @@
         <w:ind w:left="360"/>
       </w:pPr>
       <w:r>
-        <w:t>Referring to Figure 1, the hardware assembly comprises an industrial thermoplastic helmet shell (100) enclosing an electronic processing core (101). The sensing suite includes an internal/ambient temperature sensor (102), a hazardous gas sensor (103, detecting CO, CH4, H2S, and LPG), a skin-contact PPG pulse sensor (104) mounted on the inner headband, a 6-axis IMU (105, MPU6050) rigidly attached to the helmet apex, and a GPS module (106) with a ceramic patch antenna. The device is powered by a protected Li-Po battery unit (109).</w:t>
+        <w:t>Referring to Figures 1 through 9, the predictive worker safety helmet comprises an industrial high-impact thermoplastic outer shell (100) engineered to provide structural head protection. A GPS module (101) is rigidly affixed to the top crown apex to maintain an unobstructed line-of-sight satellite reception for real-time spatial positioning.</w:t>
         <w:br/>
         <w:br/>
-        <w:t>Referring to Figure 2, the operational pipeline executes the following stages:</w:t>
+        <w:t>Mounted on the front lateral perimeter is a combined environmental sensor suite (102) comprising a digital temperature sensor and a toxic gas sensor configured to measure ambient heat and dangerous concentrations of CO, CH4, H2S, and LPG. On the front brim/visor, an audiovisual warning unit (103) is integrated, comprising an acoustic piezoelectric buzzer and a high-luminescence flashing alert LED for immediate wearer warning.</w:t>
         <w:br/>
-        <w:t>1. Data Acquisition (200) &amp; Noise Filtering (201): The IMU is polled at 50 Hz, biometric sensor at 20 Hz, and gas/temperature at 1 Hz. Median and moving average filters suppress spikes and motion artifacts.</w:t>
         <w:br/>
-        <w:t>2. Dynamic Feature Extraction (202): Computes total acceleration magnitude Amag(t) = sqrt(ax^2 + ay^2 + az^2), jerk derivative J(t) = d(Amag)/dt, moving average heart rate, temperature rate-of-change (dT/dt), and gas concentration slope.</w:t>
+        <w:t>Secured to the helmet shell is an adjustable chin strap (104) having an integrated biometric photoplethysmography (PPG) pulse sensor arranged to maintain continuous contact with the wearer's skin at the jaw/neck to measure cardiovascular pulse rate. A 6-axis Inertial Measurement Unit (105, IMU combining a 3-axis accelerometer and a 3-axis gyroscope) is mounted on the lateral shell to continuously track kinematic motion, tilt angles, free-fall dynamics, and impact vectors.</w:t>
         <w:br/>
-        <w:t>3. Predictive Machine Learning Engine (203, 204): A trained Random Forest / Decision Tree model evaluates the dynamic feature vector and computes a normalized Safety Risk Score R(t) in [0, 100]. The score is classified into:</w:t>
         <w:br/>
-        <w:t xml:space="preserve">   - Low Risk (0 &lt;= R &lt; 40): Normal operational condition. Telemetry logged periodically.</w:t>
+        <w:t>The main processing and communication hub is an ESP32 microcontroller unit (106) mounted within a sealed, impact-resistant rear housing. The controller integrates a dual-core 32-bit CPU, power regulation circuitry, rechargeable lithium battery, and a hybrid Wi-Fi / LoRa wireless transceiver.</w:t>
         <w:br/>
-        <w:t xml:space="preserve">   - Medium Risk (40 &lt;= R &lt; 75): Pre-hazardous advisory state. Intermittent alert activated; advisory flagged to dashboard.</w:t>
         <w:br/>
-        <w:t xml:space="preserve">   - High Risk (75 &lt;= R &lt;= 100): Critical emergency (e.g., fall signature J &gt; 25 g/s followed by immobility, acute gas leak &gt; 50 PPM, severe cardiac distress). Continuous local alarm triggered.</w:t>
+        <w:t>The operational sequence and edge machine learning workflow are executed as follows:</w:t>
         <w:br/>
-        <w:t>4. Dual-Action Alert &amp; Telemetry (205): The helmet immediately drives buzzer and LED (107) and transmits an emergency JSON telemetry packet via Wi-Fi or LoRa (108) to the supervisory dashboard (111) with exact GPS coordinates.</w:t>
+        <w:t>1. Real-Time Multi-Sensor Acquisition: The IMU (105) is sampled at 50 Hz, biometric sensor on chin strap (104) at 20 Hz, and temperature/gas sensors (102) at 1 Hz.</w:t>
+        <w:br/>
+        <w:t>2. Dynamic Edge Preprocessing &amp; Feature Extraction: The controller (106) calculates total acceleration magnitude Amag(t) = sqrt(ax^2 + ay^2 + az^2), dynamic jerk derivative J(t) = d(Amag)/dt, moving average heart rate, temperature rate-of-change, and toxic gas slope.</w:t>
+        <w:br/>
+        <w:t>3. Predictive Risk Scoring (0–100): An onboard pre-trained machine learning model processes the feature vector to generate a continuous Safety Risk Score (R). The classification logic is partitioned into:</w:t>
+        <w:br/>
+        <w:t xml:space="preserve">   - Low Risk (0 &lt;= R &lt; 40): Normal operating state. Sensor logs transmitted periodically.</w:t>
+        <w:br/>
+        <w:t xml:space="preserve">   - Medium Risk (40 &lt;= R &lt; 75): Advisory state (e.g. rising heat or moderate gas). Intermittent warning signaled via LED (103).</w:t>
+        <w:br/>
+        <w:t xml:space="preserve">   - High Risk (75 &lt;= R &lt;= 100): Critical emergency (e.g. fall trajectory characterized by high jerk J &gt; 25 g/s followed by immobility, acute gas leak &gt; 50 PPM). Continuous local alarm triggered.</w:t>
+        <w:br/>
+        <w:t>4. Dual-Action Alert &amp; Telemetry Dispatch: The controller triggers continuous audible alarm via buzzer/LED (103) and broadcasts an emergency packet containing worker ID, telemetry, and GPS coordinates (101) over LoRa/Wi-Fi to the supervisory command center.</w:t>
       </w:r>
     </w:p>
     <w:p>
@@ -1087,10 +1093,10 @@
         <w:ind w:left="360"/>
       </w:pPr>
       <w:r>
-        <w:t>In practical deployment, a worker equips the helmet (100) and switches on the power unit (109). The microcontroller (101) performs an automated self-diagnostic check on all sensors (102-106), emits a confirmation beep via buzzer (107), and connects to the local LoRa gateway / Wi-Fi network (108).</w:t>
+        <w:t>In practical deployment, an industrial worker fastens the helmet shell (100) securely using chin strap (104) and powers on the controller unit (106). The controller executes an automatic power-on self-test diagnostic on all sensors (101, 102, 104, 105), emits a confirmation beep via buzzer (103), and establishes a wireless handshake with the local gateway.</w:t>
         <w:br/>
         <w:br/>
-        <w:t>During work operations, the IMU (105) continuously tracks head kinematics at 50 Hz while the PPG sensor (104) monitors cardiac response. If a worker loses balance and falls from height, the IMU records free-fall weightlessness followed by an impact shock (&gt;3.5g) and subsequent motionless state. Concurrently, if toxic gas levels rise (e.g., CO &gt; 35 PPM) while ambient temperature reaches 40°C, the ML model detects the compound hazard pattern and escalates the Risk Score to 95 (High Risk). Within 80 milliseconds, the local 90 dB buzzer and high-intensity LED (107) actuate, while an emergency LoRa packet containing the worker ID, biometric vitals, and GPS location is broadcast to the supervisory dashboard (111), enabling rescue teams to pinpoint and extract the worker within minutes.</w:t>
+        <w:t>During work, the IMU (105) continuously monitors head dynamics at 50 Hz. If the worker slips from scaffolding, the IMU records free-fall weightlessness followed by an impact shock (&gt;3.5g) and a motionless window. Simultaneously, if toxic gas levels exceed safety thresholds or thermal stress causes heart rate escalation (&gt;130 bpm), the edge ML model computes a compound risk score of R &gt;= 85 (High Risk). Within 80 milliseconds, the buzzer and LED (103) fire at 90 dB, and an emergency LoRa packet containing latitude and longitude from the GPS module (101) is broadcast to the supervisory command dashboard, enabling rescue teams to pinpoint and extract the worker within minutes.</w:t>
       </w:r>
     </w:p>
     <w:p>
@@ -1133,19 +1139,17 @@
         <w:br/>
         <w:t>a protective helmet shell (100) configured to be worn by an industrial worker;</w:t>
         <w:br/>
-        <w:t>an environmental sensing unit including a temperature sensor (102) and a hazardous gas sensor (103) attached to said helmet shell;</w:t>
+        <w:t>a geospatial positioning unit comprising a global positioning system (GPS) module (101) mounted to said helmet shell;</w:t>
         <w:br/>
-        <w:t>a biometric sensing unit comprising a photoplethysmography (PPG) heart rate sensor (104) positioned to maintain contact with the worker's skin;</w:t>
+        <w:t>an environmental sensing unit including a temperature and hazardous gas sensor module (102) mounted to said helmet shell;</w:t>
         <w:br/>
-        <w:t>a kinematic sensing unit comprising a 6-axis inertial measurement unit (IMU) (105) including a 3-axis accelerometer and a 3-axis gyroscope;</w:t>
+        <w:t>an audiovisual warning unit (103) comprising an acoustic buzzer and a visual light emitting diode (LED) positioned on said helmet shell;</w:t>
         <w:br/>
-        <w:t>a geospatial positioning unit comprising a global positioning system (GPS) module (106);</w:t>
+        <w:t>a chin strap (104) having an integrated biometric photoplethysmography (PPG) pulse sensor positioned to maintain skin contact;</w:t>
         <w:br/>
-        <w:t>an audiovisual warning unit (107) comprising an acoustic buzzer and a visual light emitting diode (LED);</w:t>
+        <w:t>a kinematic sensing unit comprising a 6-axis inertial measurement unit (IMU) (105) including a 3-axis accelerometer and a 3-axis gyroscope; and</w:t>
         <w:br/>
-        <w:t>a wireless communication transceiver (108) supporting dual-mode Wi-Fi and Long Range (LoRa) telemetry; and</w:t>
-        <w:br/>
-        <w:t>a microcontroller and edge processing unit (101) communicatively coupled to said sensors, warning unit, and wireless transceiver, wherein said edge processing unit is configured to extract multi-modal feature vectors from real-time sensor data, compute a predictive safety risk score (0 to 100) using an embedded machine learning model (203), categorize said score into a plurality of risk levels (204), and autonomously actuate said audiovisual warning unit (107) and transmit emergency telemetry packets to a supervisory dashboard (111) upon detection of a hazardous condition.</w:t>
+        <w:t>a microcontroller and edge processing unit (106) communicatively coupled to said sensors, warning unit, and an integrated wireless transceiver, wherein said edge processing unit is configured to extract multi-modal feature vectors from real-time sensor data, compute a predictive safety risk score (0 to 100) using an embedded machine learning model, categorize said score into a plurality of risk tiers, and autonomously actuate said audiovisual warning unit (103) and transmit emergency telemetry packets to a supervisory dashboard upon detection of a hazardous condition.</w:t>
       </w:r>
     </w:p>
     <w:p>
@@ -1154,7 +1158,7 @@
         <w:ind w:left="360"/>
       </w:pPr>
       <w:r>
-        <w:t>2. The system as claimed in claim 1, wherein said machine learning model (203) is trained on historical multi-modal industrial sensor data and evaluates an input feature vector comprising instantaneous acceleration magnitude, dynamic jerk derivative, moving average heart rate, rate of temperature increase, and toxic gas concentration to predict potential safety incidents before threshold failure.</w:t>
+        <w:t>2. The system as claimed in claim 1, wherein said machine learning model is trained on historical multi-modal industrial sensor data and evaluates an input feature vector comprising instantaneous acceleration magnitude, dynamic jerk derivative, moving average heart rate, rate of temperature increase, and toxic gas concentration to predict potential safety incidents before threshold failure.</w:t>
       </w:r>
     </w:p>
     <w:p>
@@ -1163,7 +1167,7 @@
         <w:ind w:left="360"/>
       </w:pPr>
       <w:r>
-        <w:t>3. The system as claimed in claim 1, wherein said edge processing unit (101) is configured with a tri-level risk classification logic comprising a Low Risk level (0 &lt;= R &lt; 40) signifying normal operational parameters, a Medium Risk level (40 &lt;= R &lt; 75) triggering an advisory alert on said supervisory dashboard and intermittent local warning, and a High Risk level (75 &lt;= R &lt;= 100) triggering continuous local acoustic and visual alarms and instantaneous transmission of emergency geospatial and physiological payloads.</w:t>
+        <w:t>3. The system as claimed in claim 1, wherein said edge processing unit (106) is configured with a tri-level risk classification logic comprising a Low Risk level (0 &lt;= R &lt; 40) signifying normal operational parameters, a Medium Risk level (40 &lt;= R &lt; 75) triggering an advisory alert on said supervisory dashboard and intermittent local warning, and a High Risk level (75 &lt;= R &lt;= 100) triggering continuous local acoustic and visual alarms and instantaneous transmission of emergency geospatial and physiological payloads.</w:t>
       </w:r>
     </w:p>
     <w:p>
@@ -1181,7 +1185,7 @@
         <w:ind w:left="360"/>
       </w:pPr>
       <w:r>
-        <w:t>5. The system as claimed in claim 1, wherein said hazardous gas sensor (103) is configured to detect one or more toxic and flammable gases selected from the group consisting of Carbon Monoxide (CO), Methane (CH4), Hydrogen Sulfide (H2S), and Liquefied Petroleum Gas (LPG).</w:t>
+        <w:t>5. The system as claimed in claim 1, wherein said hazardous gas sensor (102) is configured to detect one or more toxic and flammable gases selected from the group consisting of Carbon Monoxide (CO), Methane (CH4), Hydrogen Sulfide (H2S), and Liquefied Petroleum Gas (LPG).</w:t>
       </w:r>
     </w:p>
     <w:p>
@@ -1190,7 +1194,7 @@
         <w:ind w:left="360"/>
       </w:pPr>
       <w:r>
-        <w:t>6. The system as claimed in claim 1, wherein said wireless communication transceiver (108) is configured with automated failover logic to transmit emergency packets over LoRa frequencies when local Wi-Fi network connectivity is unavailable.</w:t>
+        <w:t>6. The system as claimed in claim 1, wherein said wireless transceiver of controller (106) is configured with automated failover logic to transmit emergency packets over LoRa frequencies when local Wi-Fi network connectivity is unavailable.</w:t>
       </w:r>
     </w:p>
     <w:p>
@@ -1199,7 +1203,7 @@
         <w:ind w:left="360"/>
       </w:pPr>
       <w:r>
-        <w:t>7. The system as claimed in claim 1, wherein said emergency telemetry packet transmitted to said supervisory dashboard (111) comprises worker identification code, real-time GPS coordinates, time stamp, current heart rate, ambient gas concentration, helmet temperature, and current predictive risk score.</w:t>
+        <w:t>7. The system as claimed in claim 1, wherein said emergency telemetry packet transmitted to said supervisory dashboard comprises worker identification code, real-time GPS coordinates from module (101), time stamp, current heart rate from strap sensor (104), ambient gas concentration and temperature from module (102), and current predictive risk score.</w:t>
       </w:r>
     </w:p>
     <w:p>
@@ -1210,7 +1214,7 @@
       <w:r>
         <w:t>8. A computer-implemented method for predictive occupational safety monitoring using a smart helmet, comprising the steps of:</w:t>
         <w:br/>
-        <w:t>acquiring continuous time-synchronized data streams from a multi-sensor array comprising temperature, gas, heart rate, 6-axis IMU, and GPS sensors;</w:t>
+        <w:t>acquiring continuous time-synchronized data streams from a multi-sensor array comprising temperature and gas sensor (102), biometric sensor (104), 6-axis IMU (105), and GPS module (101);</w:t>
         <w:br/>
         <w:t>filtering raw sensor data to eliminate high-frequency noise and motion artifacts;</w:t>
         <w:br/>
@@ -1220,9 +1224,9 @@
         <w:br/>
         <w:t>comparing said risk score against defined safety classification thresholds;</w:t>
         <w:br/>
-        <w:t>energizing a local audiovisual alert unit on the helmet when the risk score exceeds a predetermined threshold; and</w:t>
+        <w:t>energizing a local audiovisual alert unit (103) on the helmet when the risk score exceeds a predetermined threshold; and</w:t>
         <w:br/>
-        <w:t>transmitting an emergency telemetry packet containing geospatial location and physiological metrics over a wireless interface to a remote monitoring dashboard for emergency response coordination.</w:t>
+        <w:t>transmitting an emergency telemetry packet containing geospatial location from GPS (101) and physiological metrics over a wireless interface to a remote monitoring dashboard for emergency response coordination.</w:t>
       </w:r>
     </w:p>
     <w:p>
@@ -1253,9 +1257,9 @@
         <w:br/>
         <w:t>1. Multi-Modal Predictive Sensor Fusion vs. Static Thresholding: Instead of relying on isolated point-in-time threshold triggers, the invention dynamically correlates multi-channel physiological, environmental, and kinematic variables through an edge-optimized ML model, detecting evolving pre-incident hazards (e.g., heat stress combined with toxic gas inhalation) before worker incapacitation.</w:t>
         <w:br/>
-        <w:t>2. On-Device Edge Processing &amp; Sub-Second Latency: Embedding the feature extraction and classification model directly on the microcontroller (101) guarantees instantaneous local warning actuation without relying on cloud availability or suffering network delays.</w:t>
+        <w:t>2. On-Device Edge Processing &amp; Sub-Second Latency: Embedding the feature extraction and classification model directly on the microcontroller (106) guarantees instantaneous local warning actuation without relying on cloud availability or suffering network delays.</w:t>
         <w:br/>
-        <w:t>3. Resilient Dual-Mode Wireless Telemetry &amp; Integrated GPS: Combining Wi-Fi with sub-GHz LoRa modulation ensures reliable emergency data transmission across deep construction trenches, tunnels, and remote industrial complexes alongside precise GPS coordinates.</w:t>
+        <w:t>3. Resilient Dual-Mode Wireless Telemetry &amp; Integrated GPS: Combining Wi-Fi with sub-GHz LoRa modulation ensures reliable emergency data transmission across deep construction trenches, tunnels, and remote industrial complexes alongside precise GPS coordinates from module (101).</w:t>
       </w:r>
     </w:p>
     <w:p>
@@ -1319,7 +1323,7 @@
         <w:ind w:left="360"/>
       </w:pPr>
       <w:r>
-        <w:t>An IoT and machine learning-enabled predictive worker safety helmet and method are disclosed for real-time hazard detection and proactive occupational safety monitoring. The smart helmet comprises an industrial helmet shell (100) integrating a microcontroller unit (101), a temperature sensor (102), a hazardous gas sensor (103), a photoplethysmography heart rate sensor (104), a 6-axis inertial measurement unit (105), a GPS module (106), an audiovisual alarm (107), and a dual-mode wireless communication module (108). The edge microcontroller continuously samples multi-modal sensor feeds, removes artifacts, extracts dynamic features, and executes an onboard machine learning model (203) to compute a real-time risk score (0–100) categorized into low, medium, and high risk levels. Upon detecting hazardous events—such as falls, toxic gas leaks, excessive thermal stress, or cardiac irregularities—the helmet instantly actuates local alarms and dispatches emergency telemetry packets containing exact GPS coordinates to a central supervisory dashboard (111) for rapid rescue intervention.</w:t>
+        <w:t>An IoT and machine learning-enabled predictive worker safety helmet and method are disclosed for real-time hazard detection and proactive occupational safety monitoring. The smart helmet comprises an industrial helmet shell (100) integrating a top-mounted GPS module (101), a temperature and hazardous gas sensor (102), a front-mounted audiovisual alarm (103), a chin strap with integrated biometric pulse sensor (104), a lateral 6-axis IMU (105), and an ESP32 edge microcontroller (106) with dual-mode wireless communication. The edge microcontroller continuously samples multi-modal sensor feeds, removes artifacts, extracts dynamic features, and executes an onboard machine learning model to compute a real-time risk score (0–100) categorized into low, medium, and high risk levels. Upon detecting hazardous events—such as falls, toxic gas leaks, excessive thermal stress, or cardiac irregularities—the helmet instantly actuates local alarms (103) and dispatches emergency telemetry packets containing exact GPS coordinates (101) to a central supervisory dashboard for rapid rescue intervention.</w:t>
       </w:r>
     </w:p>
     <w:p>
@@ -1349,190 +1353,59 @@
         <w:rPr>
           <w:i/>
         </w:rPr>
-        <w:t>Drawings must not be labeled anywhere with text descriptions. Only single numerals (100-111, 200-205) are used to denote components as described in Section 8.</w:t>
+        <w:t>Technical patent drawings containing Figs. 1 to 9 with standard single-numeral callouts (100–106):</w:t>
       </w:r>
     </w:p>
     <w:p>
       <w:pPr>
-        <w:ind w:left="360"/>
+        <w:spacing w:before="160" w:after="160"/>
+        <w:jc w:val="center"/>
+      </w:pPr>
+      <w:r>
+        <w:drawing>
+          <wp:inline xmlns:a="http://schemas.openxmlformats.org/drawingml/2006/main" xmlns:pic="http://schemas.openxmlformats.org/drawingml/2006/picture">
+            <wp:extent cx="5943600" cy="3958530"/>
+            <wp:docPr id="1" name="Picture 1"/>
+            <wp:cNvGraphicFramePr>
+              <a:graphicFrameLocks noChangeAspect="1"/>
+            </wp:cNvGraphicFramePr>
+            <a:graphic>
+              <a:graphicData uri="http://schemas.openxmlformats.org/drawingml/2006/picture">
+                <pic:pic>
+                  <pic:nvPicPr>
+                    <pic:cNvPr id="0" name="patent_drawings.jpg"/>
+                    <pic:cNvPicPr/>
+                  </pic:nvPicPr>
+                  <pic:blipFill>
+                    <a:blip r:embed="rId9"/>
+                    <a:stretch>
+                      <a:fillRect/>
+                    </a:stretch>
+                  </pic:blipFill>
+                  <pic:spPr>
+                    <a:xfrm>
+                      <a:off x="0" y="0"/>
+                      <a:ext cx="5943600" cy="3958530"/>
+                    </a:xfrm>
+                    <a:prstGeom prst="rect"/>
+                  </pic:spPr>
+                </pic:pic>
+              </a:graphicData>
+            </a:graphic>
+          </wp:inline>
+        </w:drawing>
+      </w:r>
+    </w:p>
+    <w:p>
+      <w:pPr>
+        <w:jc w:val="center"/>
       </w:pPr>
       <w:r>
         <w:rPr>
           <w:b/>
+          <w:sz w:val="20"/>
         </w:rPr>
-        <w:t>Figure 1: Hardware Architecture &amp; Subsystems Block Diagram</w:t>
-      </w:r>
-    </w:p>
-    <w:p>
-      <w:pPr>
-        <w:ind w:left="360"/>
-      </w:pPr>
-      <w:r>
-        <w:rPr>
-          <w:rFonts w:ascii="Courier New" w:hAnsi="Courier New"/>
-          <w:sz w:val="17"/>
-        </w:rPr>
-        <w:t>+-----------------------------------------------------------------------------------+</w:t>
-        <w:br/>
-        <w:t>|                        SMART HELMET ENCLOSURE (100)                               |</w:t>
-        <w:br/>
-        <w:t>|                                                                                   |</w:t>
-        <w:br/>
-        <w:t>|  +--------------------+  +--------------------+  +-----------------------------+  |</w:t>
-        <w:br/>
-        <w:t>|  | Temperature Sensor |  | Toxic Gas Sensor   |  | Heart Rate (PPG) Sensor     |  |</w:t>
-        <w:br/>
-        <w:t>|  | (102)              |  | (103)              |  | (104)                       |  |</w:t>
-        <w:br/>
-        <w:t>|  +---------+----------+  +---------+----------+  +--------------+--------------+  |</w:t>
-        <w:br/>
-        <w:t>|            |                       |                            |                 |</w:t>
-        <w:br/>
-        <w:t>|            +-----------------------+----------------------------+                 |</w:t>
-        <w:br/>
-        <w:t>|                                    |                                              |</w:t>
-        <w:br/>
-        <w:t>|  +--------------------+            v             +-----------------------------+  |</w:t>
-        <w:br/>
-        <w:t>|  | 6-Axis IMU (MPU6050)| ---&gt; [ MICROCONTROLLER ] &lt;---| GPS Module (106)       |  |</w:t>
-        <w:br/>
-        <w:t>|  | (105)              |     [ &amp; EDGE PROCESSOR ] |                             |  |</w:t>
-        <w:br/>
-        <w:t>|  +--------------------+     [ (ESP32 SoC) (101)] +-----------------------------+  |</w:t>
-        <w:br/>
-        <w:t>|                                    |                                              |</w:t>
-        <w:br/>
-        <w:t>|            +-----------------------+----------------------------+                 |</w:t>
-        <w:br/>
-        <w:t>|            |                       |                            |                 |</w:t>
-        <w:br/>
-        <w:t>|            v                       v                            v                 |</w:t>
-        <w:br/>
-        <w:t>|  +--------------------+  +--------------------+  +-----------------------------+  |</w:t>
-        <w:br/>
-        <w:t>|  | Audiovisual Alert  |  | Hybrid Transceiver |  | Power Regulation &amp; Battery  |  |</w:t>
-        <w:br/>
-        <w:t>|  | (Buzzer &amp; LED)(107)|  | (Wi-Fi/LoRa) (108) |  | (109)                       |  |</w:t>
-        <w:br/>
-        <w:t>|  +--------------------+  +---------+----------+  +-----------------------------+  |</w:t>
-        <w:br/>
-        <w:t>+------------------------------------|----------------------------------------------+</w:t>
-        <w:br/>
-        <w:t xml:space="preserve">                                     | (Wireless Telemetry)</w:t>
-        <w:br/>
-        <w:t xml:space="preserve">                                     v</w:t>
-        <w:br/>
-        <w:t xml:space="preserve">                  +--------------------------------------+</w:t>
-        <w:br/>
-        <w:t xml:space="preserve">                  | Cloud Server &amp; Central Database (110)|</w:t>
-        <w:br/>
-        <w:t xml:space="preserve">                  +------------------+-------------------+</w:t>
-        <w:br/>
-        <w:t xml:space="preserve">                                     |</w:t>
-        <w:br/>
-        <w:t xml:space="preserve">                                     v</w:t>
-        <w:br/>
-        <w:t xml:space="preserve">                  +--------------------------------------+</w:t>
-        <w:br/>
-        <w:t xml:space="preserve">                  | Supervisory Monitoring Dashboard     |</w:t>
-        <w:br/>
-        <w:t xml:space="preserve">                  | &amp; Safety Officer Terminal (111)      |</w:t>
-        <w:br/>
-        <w:t xml:space="preserve">                  +--------------------------------------+</w:t>
-        <w:br/>
-        <w:t xml:space="preserve">                                 Figure 1</w:t>
-      </w:r>
-    </w:p>
-    <w:p/>
-    <w:p>
-      <w:pPr>
-        <w:ind w:left="360"/>
-      </w:pPr>
-      <w:r>
-        <w:rPr>
-          <w:b/>
-        </w:rPr>
-        <w:t>Figure 2: Machine Learning Risk Assessment &amp; Alert Pipeline</w:t>
-      </w:r>
-    </w:p>
-    <w:p>
-      <w:pPr>
-        <w:ind w:left="360"/>
-      </w:pPr>
-      <w:r>
-        <w:rPr>
-          <w:rFonts w:ascii="Courier New" w:hAnsi="Courier New"/>
-          <w:sz w:val="17"/>
-        </w:rPr>
-        <w:t>+-----------------------------------------------------------------------------------+</w:t>
-        <w:br/>
-        <w:t>|   +---------------------------------------------------------------------------+   |</w:t>
-        <w:br/>
-        <w:t>|   | (200) Multi-Sensor Data Acquisition: Temperature, Gas, HR, IMU, GPS       |   |</w:t>
-        <w:br/>
-        <w:t>|   +-------------------------------------+-------------------------------------+   |</w:t>
-        <w:br/>
-        <w:t>|                                         |                                         |</w:t>
-        <w:br/>
-        <w:t>|                                         v                                         |</w:t>
-        <w:br/>
-        <w:t>|   +---------------------------------------------------------------------------+   |</w:t>
-        <w:br/>
-        <w:t>|   | (201) Edge Preprocessing: Noise Filtering, Normalization, Spike Removal   |   |</w:t>
-        <w:br/>
-        <w:t>|   +-------------------------------------+-------------------------------------+   |</w:t>
-        <w:br/>
-        <w:t>|                                         |                                         |</w:t>
-        <w:br/>
-        <w:t>|                                         v                                         |</w:t>
-        <w:br/>
-        <w:t>|   +---------------------------------------------------------------------------+   |</w:t>
-        <w:br/>
-        <w:t>|   | (202) Feature Extraction: Accel Magnitude, Jerk, HR Variability, Gas Rate |   |</w:t>
-        <w:br/>
-        <w:t>|   +-------------------------------------+-------------------------------------+   |</w:t>
-        <w:br/>
-        <w:t>|                                         |                                         |</w:t>
-        <w:br/>
-        <w:t>|                                         v                                         |</w:t>
-        <w:br/>
-        <w:t>|   +---------------------------------------------------------------------------+   |</w:t>
-        <w:br/>
-        <w:t>|   | (203) ML Predictive Model: Random Forest / Gradient Boosted Inference     |   |</w:t>
-        <w:br/>
-        <w:t>|   +-------------------------------------+-------------------------------------+   |</w:t>
-        <w:br/>
-        <w:t>|                                         |                                         |</w:t>
-        <w:br/>
-        <w:t>|                                         v                                         |</w:t>
-        <w:br/>
-        <w:t>|   +---------------------------------------------------------------------------+   |</w:t>
-        <w:br/>
-        <w:t>|   | (204) Risk Score Calculation (0-100) &amp; Tri-Level Classification:          |   |</w:t>
-        <w:br/>
-        <w:t>|   |       • Low Risk (0-39)    --&gt; Routine Periodic Log                       |   |</w:t>
-        <w:br/>
-        <w:t>|   |       • Medium Risk (40-74)--&gt; Precautionary Advisory                     |   |</w:t>
-        <w:br/>
-        <w:t>|   |       • High Risk (75-100) --&gt; Immediate Emergency Alarm                  |   |</w:t>
-        <w:br/>
-        <w:t>|   +-------------------------------------+-------------------------------------+   |</w:t>
-        <w:br/>
-        <w:t>|                                         |                                         |</w:t>
-        <w:br/>
-        <w:t>|                                         v                                         |</w:t>
-        <w:br/>
-        <w:t>|   +---------------------------------------------------------------------------+   |</w:t>
-        <w:br/>
-        <w:t>|   | (205) Dual Action Dispatch: Local Buzzer/LED (107) + Remote Cloud/LoRa    |   |</w:t>
-        <w:br/>
-        <w:t>|   |       Alert to Supervisory Dashboard (111) with GPS Coordinates           |   |</w:t>
-        <w:br/>
-        <w:t>|   +---------------------------------------------------------------------------+   |</w:t>
-        <w:br/>
-        <w:t>+-----------------------------------------------------------------------------------+</w:t>
-        <w:br/>
-        <w:t xml:space="preserve">                                 Figure 2</w:t>
+        <w:t>Sheet 1/1: Figures 1 to 9 (Perspective, Orthographic, Sectional, Exploded, and Component Views with Reference Numerals)</w:t>
       </w:r>
     </w:p>
     <w:sectPr>

</xml_diff>